<commit_message>
Created shared dashboard layout + route structure
</commit_message>
<xml_diff>
--- a/Taskara Documentation.docx
+++ b/Taskara Documentation.docx
@@ -79,7 +79,6 @@
           <w:lang w:bidi="mr-IN"/>
         </w:rPr>
       </w:pPr>
-      <w:proofErr w:type="gramStart"/>
       <w:r>
         <w:rPr>
           <w:rFonts w:ascii="Times New Roman" w:eastAsia="Calibri" w:hAnsi="Times New Roman" w:cs="Times New Roman"/>
@@ -89,7 +88,6 @@
         </w:rPr>
         <w:t>on</w:t>
       </w:r>
-      <w:proofErr w:type="gramEnd"/>
     </w:p>
     <w:p>
       <w:pPr>
@@ -483,21 +481,8 @@
           <w:szCs w:val="32"/>
           <w:lang w:bidi="mr-IN"/>
         </w:rPr>
-        <w:t xml:space="preserve">Mrs. P.A. </w:t>
-      </w:r>
-      <w:proofErr w:type="spellStart"/>
-      <w:r>
-        <w:rPr>
-          <w:rFonts w:ascii="Times New Roman,Bold" w:eastAsia="Calibri" w:hAnsi="Times New Roman,Bold" w:cs="Times New Roman,Bold"/>
-          <w:b/>
-          <w:bCs/>
-          <w:sz w:val="32"/>
-          <w:szCs w:val="32"/>
-          <w:lang w:bidi="mr-IN"/>
-        </w:rPr>
-        <w:t>Katdare</w:t>
-      </w:r>
-      <w:proofErr w:type="spellEnd"/>
+        <w:t>Mrs. P.A. Katdare</w:t>
+      </w:r>
     </w:p>
     <w:p>
       <w:pPr>
@@ -747,29 +732,7 @@
           <w:szCs w:val="36"/>
           <w:lang w:bidi="mr-IN"/>
         </w:rPr>
-        <w:t xml:space="preserve">Dr. Datar Science, Dr. Behere Arts, Shri. </w:t>
-      </w:r>
-      <w:proofErr w:type="spellStart"/>
-      <w:r>
-        <w:rPr>
-          <w:rFonts w:ascii="Times New Roman" w:eastAsia="Times New Roman" w:hAnsi="Times New Roman" w:cs="Times New Roman"/>
-          <w:b/>
-          <w:sz w:val="36"/>
-          <w:szCs w:val="36"/>
-          <w:lang w:bidi="mr-IN"/>
-        </w:rPr>
-        <w:t>Pilukaka</w:t>
-      </w:r>
-      <w:proofErr w:type="spellEnd"/>
-      <w:r>
-        <w:rPr>
-          <w:rFonts w:ascii="Times New Roman" w:eastAsia="Times New Roman" w:hAnsi="Times New Roman" w:cs="Times New Roman"/>
-          <w:b/>
-          <w:sz w:val="36"/>
-          <w:szCs w:val="36"/>
-          <w:lang w:bidi="mr-IN"/>
-        </w:rPr>
-        <w:t xml:space="preserve"> Joshi Commerce College (Autonomous) Chiplun,</w:t>
+        <w:t>Dr. Datar Science, Dr. Behere Arts, Shri. Pilukaka Joshi Commerce College (Autonomous) Chiplun,</w:t>
       </w:r>
     </w:p>
     <w:p>
@@ -1045,7 +1008,6 @@
                 <w:lang w:bidi="mr-IN"/>
               </w:rPr>
             </w:pPr>
-            <w:proofErr w:type="spellStart"/>
             <w:r>
               <w:rPr>
                 <w:rFonts w:ascii="Times New Roman" w:eastAsia="Times New Roman" w:hAnsi="Times New Roman" w:cs="Times New Roman"/>
@@ -1054,10 +1016,57 @@
                 <w:szCs w:val="28"/>
                 <w:lang w:bidi="mr-IN"/>
               </w:rPr>
-              <w:t>Navkonkan</w:t>
-            </w:r>
-            <w:proofErr w:type="spellEnd"/>
-            <w:r>
+              <w:t>Navkonkan Education Society’s</w:t>
+            </w:r>
+          </w:p>
+          <w:p>
+            <w:pPr>
+              <w:jc w:val="center"/>
+              <w:rPr>
+                <w:rFonts w:ascii="Times New Roman" w:eastAsia="Times New Roman" w:hAnsi="Times New Roman" w:cs="Times New Roman"/>
+                <w:b/>
+                <w:sz w:val="36"/>
+                <w:szCs w:val="36"/>
+                <w:lang w:bidi="mr-IN"/>
+              </w:rPr>
+            </w:pPr>
+            <w:r>
+              <w:rPr>
+                <w:rFonts w:ascii="Times New Roman" w:eastAsia="Times New Roman" w:hAnsi="Times New Roman" w:cs="Times New Roman"/>
+                <w:b/>
+                <w:sz w:val="36"/>
+                <w:szCs w:val="36"/>
+                <w:lang w:bidi="mr-IN"/>
+              </w:rPr>
+              <w:t>Dr. Datar Science, Dr. Behere Arts, Shri. Pilukaka Joshi Commerce College (Autonomous) Chiplun,</w:t>
+            </w:r>
+          </w:p>
+          <w:p>
+            <w:pPr>
+              <w:jc w:val="center"/>
+              <w:rPr>
+                <w:rFonts w:ascii="Times New Roman" w:eastAsia="Times New Roman" w:hAnsi="Times New Roman" w:cs="Times New Roman"/>
+                <w:b/>
+                <w:sz w:val="36"/>
+                <w:szCs w:val="36"/>
+                <w:lang w:bidi="mr-IN"/>
+              </w:rPr>
+            </w:pPr>
+            <w:r>
+              <w:rPr>
+                <w:rFonts w:ascii="Times New Roman" w:eastAsia="Times New Roman" w:hAnsi="Times New Roman" w:cs="Times New Roman"/>
+                <w:b/>
+                <w:sz w:val="36"/>
+                <w:szCs w:val="36"/>
+                <w:lang w:bidi="mr-IN"/>
+              </w:rPr>
+              <w:t xml:space="preserve">(D. B. J. College, Chiplun) </w:t>
+            </w:r>
+          </w:p>
+          <w:p>
+            <w:pPr>
+              <w:spacing w:line="480" w:lineRule="auto"/>
+              <w:jc w:val="center"/>
               <w:rPr>
                 <w:rFonts w:ascii="Times New Roman" w:eastAsia="Times New Roman" w:hAnsi="Times New Roman" w:cs="Times New Roman"/>
                 <w:b/>
@@ -1065,79 +1074,8 @@
                 <w:szCs w:val="28"/>
                 <w:lang w:bidi="mr-IN"/>
               </w:rPr>
-              <w:t xml:space="preserve"> Education Society’s</w:t>
-            </w:r>
-          </w:p>
-          <w:p>
-            <w:pPr>
-              <w:jc w:val="center"/>
-              <w:rPr>
-                <w:rFonts w:ascii="Times New Roman" w:eastAsia="Times New Roman" w:hAnsi="Times New Roman" w:cs="Times New Roman"/>
-                <w:b/>
-                <w:sz w:val="36"/>
-                <w:szCs w:val="36"/>
-                <w:lang w:bidi="mr-IN"/>
-              </w:rPr>
-            </w:pPr>
-            <w:r>
-              <w:rPr>
-                <w:rFonts w:ascii="Times New Roman" w:eastAsia="Times New Roman" w:hAnsi="Times New Roman" w:cs="Times New Roman"/>
-                <w:b/>
-                <w:sz w:val="36"/>
-                <w:szCs w:val="36"/>
-                <w:lang w:bidi="mr-IN"/>
-              </w:rPr>
-              <w:t xml:space="preserve">Dr. Datar Science, Dr. Behere Arts, Shri. </w:t>
-            </w:r>
-            <w:proofErr w:type="spellStart"/>
-            <w:r>
-              <w:rPr>
-                <w:rFonts w:ascii="Times New Roman" w:eastAsia="Times New Roman" w:hAnsi="Times New Roman" w:cs="Times New Roman"/>
-                <w:b/>
-                <w:sz w:val="36"/>
-                <w:szCs w:val="36"/>
-                <w:lang w:bidi="mr-IN"/>
-              </w:rPr>
-              <w:t>Pilukaka</w:t>
-            </w:r>
-            <w:proofErr w:type="spellEnd"/>
-            <w:r>
-              <w:rPr>
-                <w:rFonts w:ascii="Times New Roman" w:eastAsia="Times New Roman" w:hAnsi="Times New Roman" w:cs="Times New Roman"/>
-                <w:b/>
-                <w:sz w:val="36"/>
-                <w:szCs w:val="36"/>
-                <w:lang w:bidi="mr-IN"/>
-              </w:rPr>
-              <w:t xml:space="preserve"> Joshi Commerce College (Autonomous) Chiplun,</w:t>
-            </w:r>
-          </w:p>
-          <w:p>
-            <w:pPr>
-              <w:jc w:val="center"/>
-              <w:rPr>
-                <w:rFonts w:ascii="Times New Roman" w:eastAsia="Times New Roman" w:hAnsi="Times New Roman" w:cs="Times New Roman"/>
-                <w:b/>
-                <w:sz w:val="36"/>
-                <w:szCs w:val="36"/>
-                <w:lang w:bidi="mr-IN"/>
-              </w:rPr>
-            </w:pPr>
-            <w:r>
-              <w:rPr>
-                <w:rFonts w:ascii="Times New Roman" w:eastAsia="Times New Roman" w:hAnsi="Times New Roman" w:cs="Times New Roman"/>
-                <w:b/>
-                <w:sz w:val="36"/>
-                <w:szCs w:val="36"/>
-                <w:lang w:bidi="mr-IN"/>
-              </w:rPr>
-              <w:t xml:space="preserve">(D. B. J. College, Chiplun) </w:t>
-            </w:r>
-          </w:p>
-          <w:p>
-            <w:pPr>
-              <w:spacing w:line="480" w:lineRule="auto"/>
-              <w:jc w:val="center"/>
+            </w:pPr>
+            <w:r>
               <w:rPr>
                 <w:rFonts w:ascii="Times New Roman" w:eastAsia="Times New Roman" w:hAnsi="Times New Roman" w:cs="Times New Roman"/>
                 <w:b/>
@@ -1145,15 +1083,6 @@
                 <w:szCs w:val="28"/>
                 <w:lang w:bidi="mr-IN"/>
               </w:rPr>
-            </w:pPr>
-            <w:r>
-              <w:rPr>
-                <w:rFonts w:ascii="Times New Roman" w:eastAsia="Times New Roman" w:hAnsi="Times New Roman" w:cs="Times New Roman"/>
-                <w:b/>
-                <w:sz w:val="28"/>
-                <w:szCs w:val="28"/>
-                <w:lang w:bidi="mr-IN"/>
-              </w:rPr>
               <w:t>(Affiliated to University of Mumbai)</w:t>
             </w:r>
           </w:p>
@@ -1354,7 +1283,6 @@
         </w:rPr>
         <w:t xml:space="preserve"> </w:t>
       </w:r>
-      <w:proofErr w:type="spellStart"/>
       <w:r>
         <w:rPr>
           <w:rFonts w:ascii="Times New Roman,Bold" w:eastAsia="Calibri" w:hAnsi="Times New Roman,Bold" w:cs="Times New Roman,Bold"/>
@@ -1364,19 +1292,7 @@
           <w:szCs w:val="24"/>
           <w:lang w:bidi="mr-IN"/>
         </w:rPr>
-        <w:t>T.Y.B.Sc</w:t>
-      </w:r>
-      <w:proofErr w:type="spellEnd"/>
-      <w:r>
-        <w:rPr>
-          <w:rFonts w:ascii="Times New Roman,Bold" w:eastAsia="Calibri" w:hAnsi="Times New Roman,Bold" w:cs="Times New Roman,Bold"/>
-          <w:b/>
-          <w:bCs/>
-          <w:sz w:val="24"/>
-          <w:szCs w:val="24"/>
-          <w:lang w:bidi="mr-IN"/>
-        </w:rPr>
-        <w:t xml:space="preserve">.(Sem V/VI) </w:t>
+        <w:t xml:space="preserve">T.Y.B.Sc.(Sem V/VI) </w:t>
       </w:r>
       <w:r>
         <w:rPr>
@@ -5734,19 +5650,28 @@
           <w:rStyle w:val="Strong"/>
           <w:rFonts w:eastAsiaTheme="majorEastAsia"/>
         </w:rPr>
-        <w:t xml:space="preserve">P. A. </w:t>
-      </w:r>
-      <w:proofErr w:type="spellStart"/>
+        <w:t>P. A. Katdare</w:t>
+      </w:r>
+      <w:r>
+        <w:t>, without whose guidance and encouragement the completion of this project would not have been possible.</w:t>
+      </w:r>
+    </w:p>
+    <w:p>
+      <w:pPr>
+        <w:pStyle w:val="NormalWeb"/>
+      </w:pPr>
+      <w:r>
+        <w:t xml:space="preserve">I would also like to thank all the respected members of the </w:t>
+      </w:r>
       <w:r>
         <w:rPr>
           <w:rStyle w:val="Strong"/>
           <w:rFonts w:eastAsiaTheme="majorEastAsia"/>
         </w:rPr>
-        <w:t>Katdare</w:t>
-      </w:r>
-      <w:proofErr w:type="spellEnd"/>
-      <w:r>
-        <w:t>, without whose guidance and encouragement the completion of this project would not have been possible.</w:t>
+        <w:t>Computer Science Department</w:t>
+      </w:r>
+      <w:r>
+        <w:t xml:space="preserve"> for their valuable support and assistance during the project development.</w:t>
       </w:r>
     </w:p>
     <w:p>
@@ -5754,70 +5679,25 @@
         <w:pStyle w:val="NormalWeb"/>
       </w:pPr>
       <w:r>
-        <w:t xml:space="preserve">I would also like to thank all the respected members of the </w:t>
+        <w:t xml:space="preserve">My sincere thanks to our respected </w:t>
       </w:r>
       <w:r>
         <w:rPr>
           <w:rStyle w:val="Strong"/>
           <w:rFonts w:eastAsiaTheme="majorEastAsia"/>
         </w:rPr>
-        <w:t>Computer Science Department</w:t>
-      </w:r>
-      <w:r>
-        <w:t xml:space="preserve"> for their valuable support and assistance during the project development.</w:t>
-      </w:r>
-    </w:p>
-    <w:p>
-      <w:pPr>
-        <w:pStyle w:val="NormalWeb"/>
-      </w:pPr>
-      <w:r>
-        <w:t xml:space="preserve">My sincere thanks to our respected </w:t>
+        <w:t>Principal Dr. Madhav Bapat Sir</w:t>
+      </w:r>
+      <w:r>
+        <w:t xml:space="preserve"> and </w:t>
       </w:r>
       <w:r>
         <w:rPr>
           <w:rStyle w:val="Strong"/>
           <w:rFonts w:eastAsiaTheme="majorEastAsia"/>
         </w:rPr>
-        <w:t>Principal Dr. Madhav Bapat Sir</w:t>
-      </w:r>
-      <w:r>
-        <w:t xml:space="preserve"> and </w:t>
-      </w:r>
-      <w:r>
-        <w:rPr>
-          <w:rStyle w:val="Strong"/>
-          <w:rFonts w:eastAsiaTheme="majorEastAsia"/>
-        </w:rPr>
-        <w:t xml:space="preserve">Head of Computer Science </w:t>
-      </w:r>
-      <w:proofErr w:type="gramStart"/>
-      <w:r>
-        <w:rPr>
-          <w:rStyle w:val="Strong"/>
-          <w:rFonts w:eastAsiaTheme="majorEastAsia"/>
-        </w:rPr>
-        <w:t>Department</w:t>
-      </w:r>
-      <w:proofErr w:type="gramEnd"/>
-      <w:r>
-        <w:rPr>
-          <w:rStyle w:val="Strong"/>
-          <w:rFonts w:eastAsiaTheme="majorEastAsia"/>
-        </w:rPr>
-        <w:t xml:space="preserve"> Mr. S. J. </w:t>
-      </w:r>
-      <w:proofErr w:type="spellStart"/>
-      <w:proofErr w:type="gramStart"/>
-      <w:r>
-        <w:rPr>
-          <w:rStyle w:val="Strong"/>
-          <w:rFonts w:eastAsiaTheme="majorEastAsia"/>
-        </w:rPr>
-        <w:t>Nalawade</w:t>
-      </w:r>
-      <w:proofErr w:type="spellEnd"/>
-      <w:proofErr w:type="gramEnd"/>
+        <w:t>Head of Computer Science Department Mr. S. J. Nalawade</w:t>
+      </w:r>
       <w:r>
         <w:t xml:space="preserve"> for providing the necessary infrastructure and facilities, including access to the Computer Lab.</w:t>
       </w:r>
@@ -6020,18 +5900,8 @@
           <w:sz w:val="24"/>
           <w:szCs w:val="24"/>
         </w:rPr>
-        <w:t xml:space="preserve">Organization Name: </w:t>
-      </w:r>
-      <w:proofErr w:type="spellStart"/>
-      <w:r>
-        <w:rPr>
-          <w:rFonts w:ascii="Times New Roman" w:hAnsi="Times New Roman" w:cs="Times New Roman"/>
-          <w:sz w:val="24"/>
-          <w:szCs w:val="24"/>
-        </w:rPr>
-        <w:t>Taskara</w:t>
-      </w:r>
-      <w:proofErr w:type="spellEnd"/>
+        <w:t>Organization Name: Taskara</w:t>
+      </w:r>
     </w:p>
     <w:p>
       <w:pPr>
@@ -6085,23 +5955,13 @@
           <w:szCs w:val="24"/>
         </w:rPr>
       </w:pPr>
-      <w:proofErr w:type="spellStart"/>
-      <w:r>
-        <w:rPr>
-          <w:rFonts w:ascii="Times New Roman" w:hAnsi="Times New Roman" w:cs="Times New Roman"/>
-          <w:sz w:val="24"/>
-          <w:szCs w:val="24"/>
-        </w:rPr>
-        <w:t>Taskara</w:t>
-      </w:r>
-      <w:proofErr w:type="spellEnd"/>
-      <w:r>
-        <w:rPr>
-          <w:rFonts w:ascii="Times New Roman" w:hAnsi="Times New Roman" w:cs="Times New Roman"/>
-          <w:sz w:val="24"/>
-          <w:szCs w:val="24"/>
-        </w:rPr>
-        <w:t>, developed by Mr. Arbaz Zameer Parkar in 2025, is a modern web-based hyperlocal service marketplace designed to connect customers with skilled service providers within their locality. The application enables users to search, compare, and book a wide range of services — including home repairs, tutoring, cleaning, fitness training, electrical work, and more — all through a unified, easy-to-use interface.</w:t>
+      <w:r>
+        <w:rPr>
+          <w:rFonts w:ascii="Times New Roman" w:hAnsi="Times New Roman" w:cs="Times New Roman"/>
+          <w:sz w:val="24"/>
+          <w:szCs w:val="24"/>
+        </w:rPr>
+        <w:t>Taskara, developed by Mr. Arbaz Zameer Parkar in 2025, is a modern web-based hyperlocal service marketplace designed to connect customers with skilled service providers within their locality. The application enables users to search, compare, and book a wide range of services — including home repairs, tutoring, cleaning, fitness training, electrical work, and more — all through a unified, easy-to-use interface.</w:t>
       </w:r>
     </w:p>
     <w:p>
@@ -6129,23 +5989,13 @@
           <w:szCs w:val="24"/>
         </w:rPr>
       </w:pPr>
-      <w:proofErr w:type="spellStart"/>
-      <w:r>
-        <w:rPr>
-          <w:rFonts w:ascii="Times New Roman" w:hAnsi="Times New Roman" w:cs="Times New Roman"/>
-          <w:sz w:val="24"/>
-          <w:szCs w:val="24"/>
-        </w:rPr>
-        <w:t>Taskara</w:t>
-      </w:r>
-      <w:proofErr w:type="spellEnd"/>
-      <w:r>
-        <w:rPr>
-          <w:rFonts w:ascii="Times New Roman" w:hAnsi="Times New Roman" w:cs="Times New Roman"/>
-          <w:sz w:val="24"/>
-          <w:szCs w:val="24"/>
-        </w:rPr>
-        <w:t xml:space="preserve"> includes role-based authentication for customers, service providers, and administrators, ensuring secure access and controlled operations across the platform. The system emphasizes convenience, reliability, and transparency to deliver a seamless service-booking experience for users who need quick, trustworthy solutions within their local area.</w:t>
+      <w:r>
+        <w:rPr>
+          <w:rFonts w:ascii="Times New Roman" w:hAnsi="Times New Roman" w:cs="Times New Roman"/>
+          <w:sz w:val="24"/>
+          <w:szCs w:val="24"/>
+        </w:rPr>
+        <w:t>Taskara includes role-based authentication for customers, service providers, and administrators, ensuring secure access and controlled operations across the platform. The system emphasizes convenience, reliability, and transparency to deliver a seamless service-booking experience for users who need quick, trustworthy solutions within their local area.</w:t>
       </w:r>
     </w:p>
     <w:p>
@@ -6173,23 +6023,13 @@
           <w:szCs w:val="24"/>
         </w:rPr>
       </w:pPr>
-      <w:proofErr w:type="spellStart"/>
-      <w:r>
-        <w:rPr>
-          <w:rFonts w:ascii="Times New Roman" w:hAnsi="Times New Roman" w:cs="Times New Roman"/>
-          <w:sz w:val="24"/>
-          <w:szCs w:val="24"/>
-        </w:rPr>
-        <w:t>Taskara</w:t>
-      </w:r>
-      <w:proofErr w:type="spellEnd"/>
-      <w:r>
-        <w:rPr>
-          <w:rFonts w:ascii="Times New Roman" w:hAnsi="Times New Roman" w:cs="Times New Roman"/>
-          <w:sz w:val="24"/>
-          <w:szCs w:val="24"/>
-        </w:rPr>
-        <w:t xml:space="preserve"> simplifies the service-booking process by offering real-time updates, automated scheduling, dynamic pricing, and a transparent review ecosystem — making it a practical and efficient solution for individuals seeking local services and for skilled professionals looking to expand their reach in the digital marketplace.</w:t>
+      <w:r>
+        <w:rPr>
+          <w:rFonts w:ascii="Times New Roman" w:hAnsi="Times New Roman" w:cs="Times New Roman"/>
+          <w:sz w:val="24"/>
+          <w:szCs w:val="24"/>
+        </w:rPr>
+        <w:t>Taskara simplifies the service-booking process by offering real-time updates, automated scheduling, dynamic pricing, and a transparent review ecosystem — making it a practical and efficient solution for individuals seeking local services and for skilled professionals looking to expand their reach in the digital marketplace.</w:t>
       </w:r>
     </w:p>
     <w:p/>
@@ -6345,25 +6185,7 @@
           <w:sz w:val="24"/>
           <w:szCs w:val="24"/>
         </w:rPr>
-        <w:t xml:space="preserve">Scheduling appointments </w:t>
-      </w:r>
-      <w:proofErr w:type="gramStart"/>
-      <w:r>
-        <w:rPr>
-          <w:rFonts w:ascii="Times New Roman" w:eastAsia="Times New Roman" w:hAnsi="Times New Roman" w:cs="Times New Roman"/>
-          <w:sz w:val="24"/>
-          <w:szCs w:val="24"/>
-        </w:rPr>
-        <w:t>is</w:t>
-      </w:r>
-      <w:proofErr w:type="gramEnd"/>
-      <w:r>
-        <w:rPr>
-          <w:rFonts w:ascii="Times New Roman" w:eastAsia="Times New Roman" w:hAnsi="Times New Roman" w:cs="Times New Roman"/>
-          <w:sz w:val="24"/>
-          <w:szCs w:val="24"/>
-        </w:rPr>
-        <w:t xml:space="preserve"> typically done manually through phone calls or messaging apps. Users must contact providers one-by-one to check availability, negotiate prices, and confirm bookings — a process that is time-consuming and prone to misunderstandings or last-minute cancellations.</w:t>
+        <w:t>Scheduling appointments is typically done manually through phone calls or messaging apps. Users must contact providers one-by-one to check availability, negotiate prices, and confirm bookings — a process that is time-consuming and prone to misunderstandings or last-minute cancellations.</w:t>
       </w:r>
     </w:p>
     <w:p>
@@ -7359,8 +7181,6 @@
     </w:p>
     <w:p>
       <w:pPr>
-        <w:ind w:firstLine="720"/>
-        <w:jc w:val="center"/>
         <w:rPr>
           <w:rFonts w:ascii="Times New Roman" w:hAnsi="Times New Roman" w:cs="Times New Roman"/>
           <w:b/>
@@ -7374,7 +7194,6 @@
     </w:p>
     <w:p>
       <w:pPr>
-        <w:ind w:firstLine="720"/>
         <w:jc w:val="center"/>
         <w:rPr>
           <w:rFonts w:ascii="Times New Roman" w:hAnsi="Times New Roman" w:cs="Times New Roman"/>
@@ -7463,25 +7282,7 @@
           <w:sz w:val="24"/>
           <w:szCs w:val="24"/>
         </w:rPr>
-        <w:t xml:space="preserve">he proposed system, </w:t>
-      </w:r>
-      <w:proofErr w:type="spellStart"/>
-      <w:r>
-        <w:rPr>
-          <w:rFonts w:ascii="Times New Roman" w:hAnsi="Times New Roman" w:cs="Times New Roman"/>
-          <w:sz w:val="24"/>
-          <w:szCs w:val="24"/>
-        </w:rPr>
-        <w:t>Taskara</w:t>
-      </w:r>
-      <w:proofErr w:type="spellEnd"/>
-      <w:r>
-        <w:rPr>
-          <w:rFonts w:ascii="Times New Roman" w:hAnsi="Times New Roman" w:cs="Times New Roman"/>
-          <w:sz w:val="24"/>
-          <w:szCs w:val="24"/>
-        </w:rPr>
-        <w:t>, is a modern web-based hyperlocal service marketplace developed using Next.js for the frontend and Node.js for the backend. It aims to eliminate the inefficiencies of the existing informal service-booking process by providing a centralized, real-time, and user-friendly platform to connect customers with skilled service providers.</w:t>
+        <w:t>he proposed system, Taskara, is a modern web-based hyperlocal service marketplace developed using Next.js for the frontend and Node.js for the backend. It aims to eliminate the inefficiencies of the existing informal service-booking process by providing a centralized, real-time, and user-friendly platform to connect customers with skilled service providers.</w:t>
       </w:r>
     </w:p>
     <w:p>
@@ -7495,23 +7296,13 @@
           <w:szCs w:val="24"/>
         </w:rPr>
       </w:pPr>
-      <w:proofErr w:type="spellStart"/>
-      <w:r>
-        <w:rPr>
-          <w:rFonts w:ascii="Times New Roman" w:hAnsi="Times New Roman" w:cs="Times New Roman"/>
-          <w:sz w:val="24"/>
-          <w:szCs w:val="24"/>
-        </w:rPr>
-        <w:t>Taskara</w:t>
-      </w:r>
-      <w:proofErr w:type="spellEnd"/>
-      <w:r>
-        <w:rPr>
-          <w:rFonts w:ascii="Times New Roman" w:hAnsi="Times New Roman" w:cs="Times New Roman"/>
-          <w:sz w:val="24"/>
-          <w:szCs w:val="24"/>
-        </w:rPr>
-        <w:t xml:space="preserve"> allows users to:</w:t>
+      <w:r>
+        <w:rPr>
+          <w:rFonts w:ascii="Times New Roman" w:hAnsi="Times New Roman" w:cs="Times New Roman"/>
+          <w:sz w:val="24"/>
+          <w:szCs w:val="24"/>
+        </w:rPr>
+        <w:t>Taskara allows users to:</w:t>
       </w:r>
     </w:p>
     <w:p>
@@ -7675,25 +7466,7 @@
           <w:sz w:val="24"/>
           <w:szCs w:val="24"/>
         </w:rPr>
-        <w:t xml:space="preserve">For service providers, </w:t>
-      </w:r>
-      <w:proofErr w:type="spellStart"/>
-      <w:r>
-        <w:rPr>
-          <w:rFonts w:ascii="Times New Roman" w:hAnsi="Times New Roman" w:cs="Times New Roman"/>
-          <w:sz w:val="24"/>
-          <w:szCs w:val="24"/>
-        </w:rPr>
-        <w:t>Taskara</w:t>
-      </w:r>
-      <w:proofErr w:type="spellEnd"/>
-      <w:r>
-        <w:rPr>
-          <w:rFonts w:ascii="Times New Roman" w:hAnsi="Times New Roman" w:cs="Times New Roman"/>
-          <w:sz w:val="24"/>
-          <w:szCs w:val="24"/>
-        </w:rPr>
-        <w:t xml:space="preserve"> offers:</w:t>
+        <w:t>For service providers, Taskara offers:</w:t>
       </w:r>
     </w:p>
     <w:p>
@@ -7741,25 +7514,7 @@
           <w:sz w:val="24"/>
           <w:szCs w:val="24"/>
         </w:rPr>
-        <w:t xml:space="preserve">Real-time notifications via </w:t>
-      </w:r>
-      <w:proofErr w:type="spellStart"/>
-      <w:r>
-        <w:rPr>
-          <w:rFonts w:ascii="Times New Roman" w:hAnsi="Times New Roman" w:cs="Times New Roman"/>
-          <w:sz w:val="24"/>
-          <w:szCs w:val="24"/>
-        </w:rPr>
-        <w:t>WebSockets</w:t>
-      </w:r>
-      <w:proofErr w:type="spellEnd"/>
-      <w:r>
-        <w:rPr>
-          <w:rFonts w:ascii="Times New Roman" w:hAnsi="Times New Roman" w:cs="Times New Roman"/>
-          <w:sz w:val="24"/>
-          <w:szCs w:val="24"/>
-        </w:rPr>
-        <w:t>, enabling providers to respond quickly to customer requests.</w:t>
+        <w:t>Real-time notifications via WebSockets, enabling providers to respond quickly to customer requests.</w:t>
       </w:r>
     </w:p>
     <w:p>
@@ -7823,25 +7578,7 @@
           <w:sz w:val="24"/>
           <w:szCs w:val="24"/>
         </w:rPr>
-        <w:t xml:space="preserve">By integrating real-time communication, structured booking management, and comprehensive provider discovery into a single application, </w:t>
-      </w:r>
-      <w:proofErr w:type="spellStart"/>
-      <w:r>
-        <w:rPr>
-          <w:rFonts w:ascii="Times New Roman" w:hAnsi="Times New Roman" w:cs="Times New Roman"/>
-          <w:sz w:val="24"/>
-          <w:szCs w:val="24"/>
-        </w:rPr>
-        <w:t>Taskara</w:t>
-      </w:r>
-      <w:proofErr w:type="spellEnd"/>
-      <w:r>
-        <w:rPr>
-          <w:rFonts w:ascii="Times New Roman" w:hAnsi="Times New Roman" w:cs="Times New Roman"/>
-          <w:sz w:val="24"/>
-          <w:szCs w:val="24"/>
-        </w:rPr>
-        <w:t xml:space="preserve"> delivers a robust and efficient solution that modernizes how local services are found, scheduled, and managed.</w:t>
+        <w:t>By integrating real-time communication, structured booking management, and comprehensive provider discovery into a single application, Taskara delivers a robust and efficient solution that modernizes how local services are found, scheduled, and managed.</w:t>
       </w:r>
     </w:p>
     <w:p>
@@ -7936,14 +7673,7 @@
       </w:r>
       <w:r>
         <w:br/>
-      </w:r>
-      <w:proofErr w:type="spellStart"/>
-      <w:r>
-        <w:t>Taskara</w:t>
-      </w:r>
-      <w:proofErr w:type="spellEnd"/>
-      <w:r>
-        <w:t xml:space="preserve"> provides live availability updates from service providers, allowing customers to instantly view open time slots and book without delays. This eliminates the traditional back-and-forth communication required to confirm schedules.</w:t>
+        <w:t>Taskara provides live availability updates from service providers, allowing customers to instantly view open time slots and book without delays. This eliminates the traditional back-and-forth communication required to confirm schedules.</w:t>
       </w:r>
     </w:p>
     <w:p>
@@ -8027,14 +7757,7 @@
       </w:r>
       <w:r>
         <w:br/>
-      </w:r>
-      <w:proofErr w:type="spellStart"/>
-      <w:r>
-        <w:t>Taskara</w:t>
-      </w:r>
-      <w:proofErr w:type="spellEnd"/>
-      <w:r>
-        <w:t xml:space="preserve"> supports dedicated login systems for customers, service providers, and administrators. Access permissions are enforced to protect personal data, manage operations securely, and maintain system integrity.</w:t>
+        <w:t>Taskara supports dedicated login systems for customers, service providers, and administrators. Access permissions are enforced to protect personal data, manage operations securely, and maintain system integrity.</w:t>
       </w:r>
     </w:p>
     <w:p>
@@ -8062,15 +7785,7 @@
       </w:r>
       <w:r>
         <w:br/>
-        <w:t xml:space="preserve">Developed using Next.js and Tailwind CSS, </w:t>
-      </w:r>
-      <w:proofErr w:type="spellStart"/>
-      <w:r>
-        <w:t>Taskara</w:t>
-      </w:r>
-      <w:proofErr w:type="spellEnd"/>
-      <w:r>
-        <w:t xml:space="preserve"> delivers a fast, responsive, and intuitive interface across all devices. The modern UI significantly enhances usability compared to informal chat-based or offline booking methods.</w:t>
+        <w:t>Developed using Next.js and Tailwind CSS, Taskara delivers a fast, responsive, and intuitive interface across all devices. The modern UI significantly enhances usability compared to informal chat-based or offline booking methods.</w:t>
       </w:r>
     </w:p>
     <w:p>
@@ -8104,7 +7819,6 @@
     <w:p>
       <w:pPr>
         <w:pStyle w:val="NormalWeb"/>
-        <w:ind w:left="720"/>
         <w:jc w:val="center"/>
         <w:rPr>
           <w:b/>
@@ -8171,14 +7885,7 @@
       </w:r>
       <w:r>
         <w:br/>
-      </w:r>
-      <w:proofErr w:type="spellStart"/>
-      <w:r>
-        <w:t>Taskara’s</w:t>
-      </w:r>
-      <w:proofErr w:type="spellEnd"/>
-      <w:r>
-        <w:t xml:space="preserve"> clean, modular backend design allows easy integration of new features, such as additional service categories, analytics dashboards, or AI-based recommendations. The architecture is built for long-term scalability and future enhancements.</w:t>
+        <w:t>Taskara’s clean, modular backend design allows easy integration of new features, such as additional service categories, analytics dashboards, or AI-based recommendations. The architecture is built for long-term scalability and future enhancements.</w:t>
       </w:r>
     </w:p>
     <w:p>
@@ -8445,41 +8152,13 @@
           <w:szCs w:val="24"/>
         </w:rPr>
       </w:pPr>
-      <w:proofErr w:type="spellStart"/>
-      <w:r>
-        <w:rPr>
-          <w:rFonts w:ascii="Times New Roman" w:hAnsi="Times New Roman" w:cs="Times New Roman"/>
-          <w:sz w:val="24"/>
-          <w:szCs w:val="24"/>
-        </w:rPr>
-        <w:t>Taskara</w:t>
-      </w:r>
-      <w:proofErr w:type="spellEnd"/>
-      <w:r>
-        <w:rPr>
-          <w:rFonts w:ascii="Times New Roman" w:hAnsi="Times New Roman" w:cs="Times New Roman"/>
-          <w:sz w:val="24"/>
-          <w:szCs w:val="24"/>
-        </w:rPr>
-        <w:t xml:space="preserve"> is developed using a modern and widely adopted web technology stack. The </w:t>
-      </w:r>
-      <w:proofErr w:type="gramStart"/>
-      <w:r>
-        <w:rPr>
-          <w:rFonts w:ascii="Times New Roman" w:hAnsi="Times New Roman" w:cs="Times New Roman"/>
-          <w:sz w:val="24"/>
-          <w:szCs w:val="24"/>
-        </w:rPr>
-        <w:t>frontend</w:t>
-      </w:r>
-      <w:proofErr w:type="gramEnd"/>
-      <w:r>
-        <w:rPr>
-          <w:rFonts w:ascii="Times New Roman" w:hAnsi="Times New Roman" w:cs="Times New Roman"/>
-          <w:sz w:val="24"/>
-          <w:szCs w:val="24"/>
-        </w:rPr>
-        <w:t xml:space="preserve"> is built with Next.js and React, offering a fast, responsive, and scalable interface suitable for web-based applications. The backend uses Node.js and Express, providing a flexible environment for handling API requests, authentication, and business logic.</w:t>
+      <w:r>
+        <w:rPr>
+          <w:rFonts w:ascii="Times New Roman" w:hAnsi="Times New Roman" w:cs="Times New Roman"/>
+          <w:sz w:val="24"/>
+          <w:szCs w:val="24"/>
+        </w:rPr>
+        <w:t>Taskara is developed using a modern and widely adopted web technology stack. The frontend is built with Next.js and React, offering a fast, responsive, and scalable interface suitable for web-based applications. The backend uses Node.js and Express, providing a flexible environment for handling API requests, authentication, and business logic.</w:t>
       </w:r>
     </w:p>
     <w:p>
@@ -8499,25 +8178,7 @@
           <w:sz w:val="24"/>
           <w:szCs w:val="24"/>
         </w:rPr>
-        <w:t xml:space="preserve">Data is stored in PostgreSQL, a powerful, free, and highly reliable database system suitable for complex relational models such as bookings, reviews, and service listings. Redis is integrated for </w:t>
-      </w:r>
-      <w:proofErr w:type="gramStart"/>
-      <w:r>
-        <w:rPr>
-          <w:rFonts w:ascii="Times New Roman" w:hAnsi="Times New Roman" w:cs="Times New Roman"/>
-          <w:sz w:val="24"/>
-          <w:szCs w:val="24"/>
-        </w:rPr>
-        <w:t>caching</w:t>
-      </w:r>
-      <w:proofErr w:type="gramEnd"/>
-      <w:r>
-        <w:rPr>
-          <w:rFonts w:ascii="Times New Roman" w:hAnsi="Times New Roman" w:cs="Times New Roman"/>
-          <w:sz w:val="24"/>
-          <w:szCs w:val="24"/>
-        </w:rPr>
-        <w:t xml:space="preserve"> and real-time booking locks, ensuring efficiency and preventing concurrent booking conflicts.</w:t>
+        <w:t>Data is stored in PostgreSQL, a powerful, free, and highly reliable database system suitable for complex relational models such as bookings, reviews, and service listings. Redis is integrated for caching and real-time booking locks, ensuring efficiency and preventing concurrent booking conflicts.</w:t>
       </w:r>
     </w:p>
     <w:p>
@@ -8537,25 +8198,7 @@
           <w:sz w:val="24"/>
           <w:szCs w:val="24"/>
         </w:rPr>
-        <w:t xml:space="preserve">Real-time communication is powered by Socket.IO, allowing instant </w:t>
-      </w:r>
-      <w:proofErr w:type="gramStart"/>
-      <w:r>
-        <w:rPr>
-          <w:rFonts w:ascii="Times New Roman" w:hAnsi="Times New Roman" w:cs="Times New Roman"/>
-          <w:sz w:val="24"/>
-          <w:szCs w:val="24"/>
-        </w:rPr>
-        <w:t>booking updates</w:t>
-      </w:r>
-      <w:proofErr w:type="gramEnd"/>
-      <w:r>
-        <w:rPr>
-          <w:rFonts w:ascii="Times New Roman" w:hAnsi="Times New Roman" w:cs="Times New Roman"/>
-          <w:sz w:val="24"/>
-          <w:szCs w:val="24"/>
-        </w:rPr>
-        <w:t xml:space="preserve"> and notifications without requiring complex infrastructure. All chosen technologies are free, well-documented, and widely used in both industry and academia.</w:t>
+        <w:t>Real-time communication is powered by Socket.IO, allowing instant booking updates and notifications without requiring complex infrastructure. All chosen technologies are free, well-documented, and widely used in both industry and academia.</w:t>
       </w:r>
     </w:p>
     <w:p>
@@ -8627,43 +8270,7 @@
           <w:sz w:val="24"/>
           <w:szCs w:val="24"/>
         </w:rPr>
-        <w:t xml:space="preserve">The project is highly cost-effective. All core technologies used — Next.js, React, Node.js, PostgreSQL, Redis, Socket.IO, and supporting development tools — are open-source and free to use. Deployment options such as Railway, Render, </w:t>
-      </w:r>
-      <w:proofErr w:type="spellStart"/>
-      <w:r>
-        <w:rPr>
-          <w:rFonts w:ascii="Times New Roman" w:hAnsi="Times New Roman" w:cs="Times New Roman"/>
-          <w:sz w:val="24"/>
-          <w:szCs w:val="24"/>
-        </w:rPr>
-        <w:t>Vercel</w:t>
-      </w:r>
-      <w:proofErr w:type="spellEnd"/>
-      <w:r>
-        <w:rPr>
-          <w:rFonts w:ascii="Times New Roman" w:hAnsi="Times New Roman" w:cs="Times New Roman"/>
-          <w:sz w:val="24"/>
-          <w:szCs w:val="24"/>
-        </w:rPr>
-        <w:t xml:space="preserve">, and </w:t>
-      </w:r>
-      <w:proofErr w:type="spellStart"/>
-      <w:r>
-        <w:rPr>
-          <w:rFonts w:ascii="Times New Roman" w:hAnsi="Times New Roman" w:cs="Times New Roman"/>
-          <w:sz w:val="24"/>
-          <w:szCs w:val="24"/>
-        </w:rPr>
-        <w:t>Mailtrap</w:t>
-      </w:r>
-      <w:proofErr w:type="spellEnd"/>
-      <w:r>
-        <w:rPr>
-          <w:rFonts w:ascii="Times New Roman" w:hAnsi="Times New Roman" w:cs="Times New Roman"/>
-          <w:sz w:val="24"/>
-          <w:szCs w:val="24"/>
-        </w:rPr>
-        <w:t xml:space="preserve"> also provide free tiers suitable for academic and personal use.</w:t>
+        <w:t>The project is highly cost-effective. All core technologies used — Next.js, React, Node.js, PostgreSQL, Redis, Socket.IO, and supporting development tools — are open-source and free to use. Deployment options such as Railway, Render, Vercel, and Mailtrap also provide free tiers suitable for academic and personal use.</w:t>
       </w:r>
     </w:p>
     <w:p>
@@ -8683,25 +8290,7 @@
           <w:sz w:val="24"/>
           <w:szCs w:val="24"/>
         </w:rPr>
-        <w:t xml:space="preserve">Since </w:t>
-      </w:r>
-      <w:proofErr w:type="spellStart"/>
-      <w:r>
-        <w:rPr>
-          <w:rFonts w:ascii="Times New Roman" w:hAnsi="Times New Roman" w:cs="Times New Roman"/>
-          <w:sz w:val="24"/>
-          <w:szCs w:val="24"/>
-        </w:rPr>
-        <w:t>Taskara</w:t>
-      </w:r>
-      <w:proofErr w:type="spellEnd"/>
-      <w:r>
-        <w:rPr>
-          <w:rFonts w:ascii="Times New Roman" w:hAnsi="Times New Roman" w:cs="Times New Roman"/>
-          <w:sz w:val="24"/>
-          <w:szCs w:val="24"/>
-        </w:rPr>
-        <w:t xml:space="preserve"> simulates payment flows and uses open mapping solutions like OpenStreetMap, no paid APIs or third-party subscriptions are required. This makes the project feasible for students and developers without incurring any financial cost.</w:t>
+        <w:t>Since Taskara simulates payment flows and uses open mapping solutions like OpenStreetMap, no paid APIs or third-party subscriptions are required. This makes the project feasible for students and developers without incurring any financial cost.</w:t>
       </w:r>
     </w:p>
     <w:p>
@@ -8721,25 +8310,7 @@
           <w:sz w:val="24"/>
           <w:szCs w:val="24"/>
         </w:rPr>
-        <w:t xml:space="preserve">Overall, </w:t>
-      </w:r>
-      <w:proofErr w:type="spellStart"/>
-      <w:r>
-        <w:rPr>
-          <w:rFonts w:ascii="Times New Roman" w:hAnsi="Times New Roman" w:cs="Times New Roman"/>
-          <w:sz w:val="24"/>
-          <w:szCs w:val="24"/>
-        </w:rPr>
-        <w:t>Taskara</w:t>
-      </w:r>
-      <w:proofErr w:type="spellEnd"/>
-      <w:r>
-        <w:rPr>
-          <w:rFonts w:ascii="Times New Roman" w:hAnsi="Times New Roman" w:cs="Times New Roman"/>
-          <w:sz w:val="24"/>
-          <w:szCs w:val="24"/>
-        </w:rPr>
-        <w:t xml:space="preserve"> can be developed, tested, and deployed end-to-end using entirely free resources, fulfilling the economic constraints of an academic project.</w:t>
+        <w:t>Overall, Taskara can be developed, tested, and deployed end-to-end using entirely free resources, fulfilling the economic constraints of an academic project.</w:t>
       </w:r>
     </w:p>
     <w:p>
@@ -8851,23 +8422,13 @@
           <w:szCs w:val="24"/>
         </w:rPr>
       </w:pPr>
-      <w:proofErr w:type="spellStart"/>
-      <w:r>
-        <w:rPr>
-          <w:rFonts w:ascii="Times New Roman" w:hAnsi="Times New Roman" w:cs="Times New Roman"/>
-          <w:sz w:val="24"/>
-          <w:szCs w:val="24"/>
-        </w:rPr>
-        <w:t>Taskara</w:t>
-      </w:r>
-      <w:proofErr w:type="spellEnd"/>
-      <w:r>
-        <w:rPr>
-          <w:rFonts w:ascii="Times New Roman" w:hAnsi="Times New Roman" w:cs="Times New Roman"/>
-          <w:sz w:val="24"/>
-          <w:szCs w:val="24"/>
-        </w:rPr>
-        <w:t xml:space="preserve"> offers a user-friendly web interface accessible from any modern browser, eliminating the need for installation or specialized hardware. Customers can easily search for services, view provider profiles, schedule appointments, and track booking status with minimal technical knowledge.</w:t>
+      <w:r>
+        <w:rPr>
+          <w:rFonts w:ascii="Times New Roman" w:hAnsi="Times New Roman" w:cs="Times New Roman"/>
+          <w:sz w:val="24"/>
+          <w:szCs w:val="24"/>
+        </w:rPr>
+        <w:t>Taskara offers a user-friendly web interface accessible from any modern browser, eliminating the need for installation or specialized hardware. Customers can easily search for services, view provider profiles, schedule appointments, and track booking status with minimal technical knowledge.</w:t>
       </w:r>
     </w:p>
     <w:p>
@@ -11958,27 +11519,7 @@
                 <w:sz w:val="24"/>
                 <w:szCs w:val="24"/>
               </w:rPr>
-              <w:t xml:space="preserve">Feedback </w:t>
-            </w:r>
-            <w:proofErr w:type="gramStart"/>
-            <w:r>
-              <w:rPr>
-                <w:rFonts w:ascii="Times New Roman" w:hAnsi="Times New Roman" w:cs="Times New Roman"/>
-                <w:b/>
-                <w:sz w:val="24"/>
-                <w:szCs w:val="24"/>
-              </w:rPr>
-              <w:t>for</w:t>
-            </w:r>
-            <w:proofErr w:type="gramEnd"/>
-            <w:r>
-              <w:rPr>
-                <w:rFonts w:ascii="Times New Roman" w:hAnsi="Times New Roman" w:cs="Times New Roman"/>
-                <w:b/>
-                <w:sz w:val="24"/>
-                <w:szCs w:val="24"/>
-              </w:rPr>
-              <w:t xml:space="preserve"> Improving, Correcting &amp; Modifying the Project</w:t>
+              <w:t>Feedback for Improving, Correcting &amp; Modifying the Project</w:t>
             </w:r>
           </w:p>
         </w:tc>
@@ -12564,9 +12105,8 @@
           <w:sz w:val="96"/>
           <w:szCs w:val="96"/>
         </w:rPr>
-        <w:t xml:space="preserve">PHASE – </w:t>
-      </w:r>
-      <w:proofErr w:type="gramStart"/>
+        <w:t xml:space="preserve">PHASE – 2 </w:t>
+      </w:r>
       <w:r>
         <w:rPr>
           <w:rFonts w:ascii="Times New Roman" w:hAnsi="Times New Roman" w:cs="Times New Roman"/>
@@ -12575,7 +12115,7 @@
           <w:sz w:val="96"/>
           <w:szCs w:val="96"/>
         </w:rPr>
-        <w:t xml:space="preserve">2 </w:t>
+        <w:t xml:space="preserve"> </w:t>
       </w:r>
       <w:r>
         <w:rPr>
@@ -12585,28 +12125,7 @@
           <w:sz w:val="96"/>
           <w:szCs w:val="96"/>
         </w:rPr>
-        <w:t xml:space="preserve"> </w:t>
-      </w:r>
-      <w:r>
-        <w:rPr>
-          <w:rFonts w:ascii="Times New Roman" w:hAnsi="Times New Roman" w:cs="Times New Roman"/>
-          <w:b/>
-          <w:i/>
-          <w:sz w:val="96"/>
-          <w:szCs w:val="96"/>
-        </w:rPr>
-        <w:t>SYSTEM</w:t>
-      </w:r>
-      <w:proofErr w:type="gramEnd"/>
-      <w:r>
-        <w:rPr>
-          <w:rFonts w:ascii="Times New Roman" w:hAnsi="Times New Roman" w:cs="Times New Roman"/>
-          <w:b/>
-          <w:i/>
-          <w:sz w:val="96"/>
-          <w:szCs w:val="96"/>
-        </w:rPr>
-        <w:t xml:space="preserve"> ANALYSIS</w:t>
+        <w:t>SYSTEM ANALYSIS</w:t>
       </w:r>
     </w:p>
     <w:p>
@@ -12837,15 +12356,7 @@
         <w:t>⇒</w:t>
       </w:r>
       <w:r>
-        <w:t xml:space="preserve"> Yes, because every provider has different pricing and I </w:t>
-      </w:r>
-      <w:proofErr w:type="gramStart"/>
-      <w:r>
-        <w:t>have to</w:t>
-      </w:r>
-      <w:proofErr w:type="gramEnd"/>
-      <w:r>
-        <w:t xml:space="preserve"> contact each one individually. It becomes time-consuming to compare.</w:t>
+        <w:t xml:space="preserve"> Yes, because every provider has different pricing and I have to contact each one individually. It becomes time-consuming to compare.</w:t>
       </w:r>
     </w:p>
     <w:p>
@@ -14482,23 +13993,13 @@
                 <w:szCs w:val="24"/>
               </w:rPr>
             </w:pPr>
-            <w:proofErr w:type="gramStart"/>
-            <w:r>
-              <w:rPr>
-                <w:rFonts w:ascii="Times New Roman" w:hAnsi="Times New Roman" w:cs="Times New Roman"/>
-                <w:sz w:val="24"/>
-                <w:szCs w:val="24"/>
-              </w:rPr>
-              <w:t>Fetch</w:t>
-            </w:r>
-            <w:proofErr w:type="gramEnd"/>
-            <w:r>
-              <w:rPr>
-                <w:rFonts w:ascii="Times New Roman" w:hAnsi="Times New Roman" w:cs="Times New Roman"/>
-                <w:sz w:val="24"/>
-                <w:szCs w:val="24"/>
-              </w:rPr>
-              <w:t xml:space="preserve"> Provider Details</w:t>
+            <w:r>
+              <w:rPr>
+                <w:rFonts w:ascii="Times New Roman" w:hAnsi="Times New Roman" w:cs="Times New Roman"/>
+                <w:sz w:val="24"/>
+                <w:szCs w:val="24"/>
+              </w:rPr>
+              <w:t>Fetch Provider Details</w:t>
             </w:r>
           </w:p>
         </w:tc>
@@ -16615,23 +16116,13 @@
                 <w:szCs w:val="24"/>
               </w:rPr>
             </w:pPr>
-            <w:proofErr w:type="gramStart"/>
-            <w:r>
-              <w:rPr>
-                <w:rFonts w:ascii="Times New Roman" w:hAnsi="Times New Roman" w:cs="Times New Roman"/>
-                <w:sz w:val="24"/>
-                <w:szCs w:val="24"/>
-              </w:rPr>
-              <w:t>Suspend</w:t>
-            </w:r>
-            <w:proofErr w:type="gramEnd"/>
-            <w:r>
-              <w:rPr>
-                <w:rFonts w:ascii="Times New Roman" w:hAnsi="Times New Roman" w:cs="Times New Roman"/>
-                <w:sz w:val="24"/>
-                <w:szCs w:val="24"/>
-              </w:rPr>
-              <w:t xml:space="preserve"> Button Clicked</w:t>
+            <w:r>
+              <w:rPr>
+                <w:rFonts w:ascii="Times New Roman" w:hAnsi="Times New Roman" w:cs="Times New Roman"/>
+                <w:sz w:val="24"/>
+                <w:szCs w:val="24"/>
+              </w:rPr>
+              <w:t>Suspend Button Clicked</w:t>
             </w:r>
           </w:p>
         </w:tc>
@@ -17043,6 +16534,9 @@
     </w:p>
     <w:p>
       <w:pPr>
+        <w:pBdr>
+          <w:bottom w:val="single" w:sz="4" w:space="1" w:color="auto"/>
+        </w:pBdr>
         <w:tabs>
           <w:tab w:val="left" w:pos="3396"/>
         </w:tabs>
@@ -17051,12 +16545,509 @@
           <w:rFonts w:ascii="Times New Roman" w:hAnsi="Times New Roman" w:cs="Times New Roman"/>
           <w:b/>
           <w:bCs/>
+          <w:sz w:val="40"/>
+          <w:szCs w:val="40"/>
+        </w:rPr>
+      </w:pPr>
+      <w:r>
+        <w:rPr>
+          <w:rFonts w:ascii="Times New Roman" w:hAnsi="Times New Roman" w:cs="Times New Roman"/>
+          <w:b/>
+          <w:bCs/>
+          <w:sz w:val="40"/>
+          <w:szCs w:val="40"/>
+        </w:rPr>
+        <w:lastRenderedPageBreak/>
+        <w:t>USE CASE DIAGRAM</w:t>
+      </w:r>
+    </w:p>
+    <w:p>
+      <w:pPr>
+        <w:rPr>
+          <w:rFonts w:ascii="Times New Roman" w:hAnsi="Times New Roman" w:cs="Times New Roman"/>
+          <w:b/>
+          <w:bCs/>
+          <w:sz w:val="40"/>
+          <w:szCs w:val="40"/>
+        </w:rPr>
+      </w:pPr>
+    </w:p>
+    <w:p>
+      <w:pPr>
+        <w:rPr>
+          <w:rFonts w:ascii="Times New Roman" w:hAnsi="Times New Roman" w:cs="Times New Roman"/>
+          <w:b/>
+          <w:bCs/>
+          <w:sz w:val="40"/>
+          <w:szCs w:val="40"/>
+        </w:rPr>
+      </w:pPr>
+    </w:p>
+    <w:p>
+      <w:pPr>
+        <w:rPr>
+          <w:rFonts w:ascii="Times New Roman" w:hAnsi="Times New Roman" w:cs="Times New Roman"/>
+          <w:sz w:val="40"/>
+          <w:szCs w:val="40"/>
+        </w:rPr>
+      </w:pPr>
+      <w:r>
+        <w:rPr>
+          <w:rFonts w:ascii="Times New Roman" w:hAnsi="Times New Roman" w:cs="Times New Roman"/>
+          <w:sz w:val="40"/>
+          <w:szCs w:val="40"/>
+        </w:rPr>
+        <w:drawing>
+          <wp:inline distT="0" distB="0" distL="0" distR="0" wp14:anchorId="6EEEE2B5" wp14:editId="606822CC">
+            <wp:extent cx="5829300" cy="4975860"/>
+            <wp:effectExtent l="0" t="0" r="0" b="0"/>
+            <wp:docPr id="1656918825" name="Picture 2"/>
+            <wp:cNvGraphicFramePr>
+              <a:graphicFrameLocks xmlns:a="http://schemas.openxmlformats.org/drawingml/2006/main" noChangeAspect="1"/>
+            </wp:cNvGraphicFramePr>
+            <a:graphic xmlns:a="http://schemas.openxmlformats.org/drawingml/2006/main">
+              <a:graphicData uri="http://schemas.openxmlformats.org/drawingml/2006/picture">
+                <pic:pic xmlns:pic="http://schemas.openxmlformats.org/drawingml/2006/picture">
+                  <pic:nvPicPr>
+                    <pic:cNvPr id="0" name="Picture 6"/>
+                    <pic:cNvPicPr>
+                      <a:picLocks noChangeAspect="1" noChangeArrowheads="1"/>
+                    </pic:cNvPicPr>
+                  </pic:nvPicPr>
+                  <pic:blipFill>
+                    <a:blip r:embed="rId8">
+                      <a:extLst>
+                        <a:ext uri="{28A0092B-C50C-407E-A947-70E740481C1C}">
+                          <a14:useLocalDpi xmlns:a14="http://schemas.microsoft.com/office/drawing/2010/main" val="0"/>
+                        </a:ext>
+                      </a:extLst>
+                    </a:blip>
+                    <a:srcRect/>
+                    <a:stretch>
+                      <a:fillRect/>
+                    </a:stretch>
+                  </pic:blipFill>
+                  <pic:spPr bwMode="auto">
+                    <a:xfrm>
+                      <a:off x="0" y="0"/>
+                      <a:ext cx="5829300" cy="4975860"/>
+                    </a:xfrm>
+                    <a:prstGeom prst="rect">
+                      <a:avLst/>
+                    </a:prstGeom>
+                    <a:noFill/>
+                    <a:ln>
+                      <a:noFill/>
+                    </a:ln>
+                  </pic:spPr>
+                </pic:pic>
+              </a:graphicData>
+            </a:graphic>
+          </wp:inline>
+        </w:drawing>
+      </w:r>
+    </w:p>
+    <w:p>
+      <w:pPr>
+        <w:rPr>
+          <w:rFonts w:ascii="Times New Roman" w:hAnsi="Times New Roman" w:cs="Times New Roman"/>
+          <w:sz w:val="40"/>
+          <w:szCs w:val="40"/>
+        </w:rPr>
+      </w:pPr>
+    </w:p>
+    <w:p>
+      <w:pPr>
+        <w:rPr>
+          <w:rFonts w:ascii="Times New Roman" w:hAnsi="Times New Roman" w:cs="Times New Roman"/>
+          <w:sz w:val="40"/>
+          <w:szCs w:val="40"/>
+        </w:rPr>
+      </w:pPr>
+    </w:p>
+    <w:p>
+      <w:pPr>
+        <w:rPr>
+          <w:rFonts w:ascii="Times New Roman" w:hAnsi="Times New Roman" w:cs="Times New Roman"/>
+          <w:sz w:val="40"/>
+          <w:szCs w:val="40"/>
+        </w:rPr>
+      </w:pPr>
+    </w:p>
+    <w:p>
+      <w:pPr>
+        <w:rPr>
+          <w:rFonts w:ascii="Times New Roman" w:hAnsi="Times New Roman" w:cs="Times New Roman"/>
+          <w:sz w:val="24"/>
+          <w:szCs w:val="24"/>
+        </w:rPr>
+      </w:pPr>
+    </w:p>
+    <w:p>
+      <w:pPr>
+        <w:jc w:val="center"/>
+        <w:rPr>
+          <w:rFonts w:ascii="Times New Roman" w:hAnsi="Times New Roman" w:cs="Times New Roman"/>
+          <w:b/>
+          <w:bCs/>
           <w:i/>
           <w:iCs/>
           <w:sz w:val="24"/>
           <w:szCs w:val="24"/>
         </w:rPr>
       </w:pPr>
+      <w:r>
+        <w:rPr>
+          <w:rFonts w:ascii="Times New Roman" w:hAnsi="Times New Roman" w:cs="Times New Roman"/>
+          <w:b/>
+          <w:bCs/>
+          <w:i/>
+          <w:iCs/>
+          <w:sz w:val="24"/>
+          <w:szCs w:val="24"/>
+        </w:rPr>
+        <w:t>24</w:t>
+      </w:r>
+    </w:p>
+    <w:p>
+      <w:pPr>
+        <w:jc w:val="center"/>
+        <w:rPr>
+          <w:b/>
+          <w:bCs/>
+          <w:i/>
+          <w:iCs/>
+        </w:rPr>
+      </w:pPr>
+      <w:r>
+        <w:rPr>
+          <w:rFonts w:ascii="Times New Roman" w:hAnsi="Times New Roman" w:cs="Times New Roman"/>
+          <w:b/>
+          <w:bCs/>
+          <w:i/>
+          <w:iCs/>
+          <w:sz w:val="24"/>
+          <w:szCs w:val="24"/>
+        </w:rPr>
+        <w:lastRenderedPageBreak/>
+        <w:drawing>
+          <wp:inline distT="0" distB="0" distL="0" distR="0" wp14:anchorId="055638CF" wp14:editId="62038033">
+            <wp:extent cx="6202680" cy="3870960"/>
+            <wp:effectExtent l="0" t="0" r="7620" b="0"/>
+            <wp:docPr id="1938839027" name="Picture 8"/>
+            <wp:cNvGraphicFramePr>
+              <a:graphicFrameLocks xmlns:a="http://schemas.openxmlformats.org/drawingml/2006/main" noChangeAspect="1"/>
+            </wp:cNvGraphicFramePr>
+            <a:graphic xmlns:a="http://schemas.openxmlformats.org/drawingml/2006/main">
+              <a:graphicData uri="http://schemas.openxmlformats.org/drawingml/2006/picture">
+                <pic:pic xmlns:pic="http://schemas.openxmlformats.org/drawingml/2006/picture">
+                  <pic:nvPicPr>
+                    <pic:cNvPr id="0" name="Picture 30"/>
+                    <pic:cNvPicPr>
+                      <a:picLocks noChangeAspect="1" noChangeArrowheads="1"/>
+                    </pic:cNvPicPr>
+                  </pic:nvPicPr>
+                  <pic:blipFill>
+                    <a:blip r:embed="rId9">
+                      <a:extLst>
+                        <a:ext uri="{28A0092B-C50C-407E-A947-70E740481C1C}">
+                          <a14:useLocalDpi xmlns:a14="http://schemas.microsoft.com/office/drawing/2010/main" val="0"/>
+                        </a:ext>
+                      </a:extLst>
+                    </a:blip>
+                    <a:srcRect/>
+                    <a:stretch>
+                      <a:fillRect/>
+                    </a:stretch>
+                  </pic:blipFill>
+                  <pic:spPr bwMode="auto">
+                    <a:xfrm>
+                      <a:off x="0" y="0"/>
+                      <a:ext cx="6202680" cy="3870960"/>
+                    </a:xfrm>
+                    <a:prstGeom prst="rect">
+                      <a:avLst/>
+                    </a:prstGeom>
+                    <a:noFill/>
+                    <a:ln>
+                      <a:noFill/>
+                    </a:ln>
+                  </pic:spPr>
+                </pic:pic>
+              </a:graphicData>
+            </a:graphic>
+          </wp:inline>
+        </w:drawing>
+      </w:r>
+    </w:p>
+    <w:p>
+      <w:pPr>
+        <w:jc w:val="center"/>
+        <w:rPr>
+          <w:rFonts w:ascii="Times New Roman" w:hAnsi="Times New Roman" w:cs="Times New Roman"/>
+          <w:b/>
+          <w:bCs/>
+          <w:i/>
+          <w:iCs/>
+          <w:sz w:val="24"/>
+          <w:szCs w:val="24"/>
+        </w:rPr>
+      </w:pPr>
+      <w:r>
+        <w:rPr>
+          <w:rFonts w:ascii="Times New Roman" w:hAnsi="Times New Roman" w:cs="Times New Roman"/>
+          <w:b/>
+          <w:bCs/>
+          <w:i/>
+          <w:iCs/>
+          <w:sz w:val="24"/>
+          <w:szCs w:val="24"/>
+        </w:rPr>
+        <w:drawing>
+          <wp:inline distT="0" distB="0" distL="0" distR="0" wp14:anchorId="35DA66ED" wp14:editId="14A31D68">
+            <wp:extent cx="6187440" cy="3848100"/>
+            <wp:effectExtent l="0" t="0" r="3810" b="0"/>
+            <wp:docPr id="824722662" name="Picture 12"/>
+            <wp:cNvGraphicFramePr>
+              <a:graphicFrameLocks xmlns:a="http://schemas.openxmlformats.org/drawingml/2006/main" noChangeAspect="1"/>
+            </wp:cNvGraphicFramePr>
+            <a:graphic xmlns:a="http://schemas.openxmlformats.org/drawingml/2006/main">
+              <a:graphicData uri="http://schemas.openxmlformats.org/drawingml/2006/picture">
+                <pic:pic xmlns:pic="http://schemas.openxmlformats.org/drawingml/2006/picture">
+                  <pic:nvPicPr>
+                    <pic:cNvPr id="0" name="Picture 44"/>
+                    <pic:cNvPicPr>
+                      <a:picLocks noChangeAspect="1" noChangeArrowheads="1"/>
+                    </pic:cNvPicPr>
+                  </pic:nvPicPr>
+                  <pic:blipFill>
+                    <a:blip r:embed="rId10">
+                      <a:extLst>
+                        <a:ext uri="{28A0092B-C50C-407E-A947-70E740481C1C}">
+                          <a14:useLocalDpi xmlns:a14="http://schemas.microsoft.com/office/drawing/2010/main" val="0"/>
+                        </a:ext>
+                      </a:extLst>
+                    </a:blip>
+                    <a:srcRect/>
+                    <a:stretch>
+                      <a:fillRect/>
+                    </a:stretch>
+                  </pic:blipFill>
+                  <pic:spPr bwMode="auto">
+                    <a:xfrm>
+                      <a:off x="0" y="0"/>
+                      <a:ext cx="6187440" cy="3848100"/>
+                    </a:xfrm>
+                    <a:prstGeom prst="rect">
+                      <a:avLst/>
+                    </a:prstGeom>
+                    <a:noFill/>
+                    <a:ln>
+                      <a:noFill/>
+                    </a:ln>
+                  </pic:spPr>
+                </pic:pic>
+              </a:graphicData>
+            </a:graphic>
+          </wp:inline>
+        </w:drawing>
+      </w:r>
+    </w:p>
+    <w:p>
+      <w:pPr>
+        <w:jc w:val="center"/>
+        <w:rPr>
+          <w:rFonts w:ascii="Times New Roman" w:hAnsi="Times New Roman" w:cs="Times New Roman"/>
+          <w:b/>
+          <w:bCs/>
+          <w:i/>
+          <w:iCs/>
+          <w:sz w:val="24"/>
+          <w:szCs w:val="24"/>
+        </w:rPr>
+      </w:pPr>
+      <w:r>
+        <w:rPr>
+          <w:rFonts w:ascii="Times New Roman" w:hAnsi="Times New Roman" w:cs="Times New Roman"/>
+          <w:b/>
+          <w:bCs/>
+          <w:i/>
+          <w:iCs/>
+          <w:sz w:val="24"/>
+          <w:szCs w:val="24"/>
+        </w:rPr>
+        <w:t>25</w:t>
+      </w:r>
+    </w:p>
+    <w:p>
+      <w:pPr>
+        <w:jc w:val="center"/>
+        <w:rPr>
+          <w:rFonts w:ascii="Times New Roman" w:hAnsi="Times New Roman" w:cs="Times New Roman"/>
+          <w:b/>
+          <w:bCs/>
+          <w:i/>
+          <w:iCs/>
+          <w:sz w:val="24"/>
+          <w:szCs w:val="24"/>
+        </w:rPr>
+      </w:pPr>
+      <w:r>
+        <w:rPr>
+          <w:rFonts w:ascii="Times New Roman" w:hAnsi="Times New Roman" w:cs="Times New Roman"/>
+          <w:b/>
+          <w:bCs/>
+          <w:i/>
+          <w:iCs/>
+          <w:sz w:val="24"/>
+          <w:szCs w:val="24"/>
+        </w:rPr>
+        <w:lastRenderedPageBreak/>
+        <w:drawing>
+          <wp:inline distT="0" distB="0" distL="0" distR="0" wp14:anchorId="12F4C58A" wp14:editId="0E53458A">
+            <wp:extent cx="5943600" cy="6243955"/>
+            <wp:effectExtent l="0" t="0" r="0" b="4445"/>
+            <wp:docPr id="81846243" name="Picture 14"/>
+            <wp:cNvGraphicFramePr>
+              <a:graphicFrameLocks xmlns:a="http://schemas.openxmlformats.org/drawingml/2006/main" noChangeAspect="1"/>
+            </wp:cNvGraphicFramePr>
+            <a:graphic xmlns:a="http://schemas.openxmlformats.org/drawingml/2006/main">
+              <a:graphicData uri="http://schemas.openxmlformats.org/drawingml/2006/picture">
+                <pic:pic xmlns:pic="http://schemas.openxmlformats.org/drawingml/2006/picture">
+                  <pic:nvPicPr>
+                    <pic:cNvPr id="0" name="Picture 51"/>
+                    <pic:cNvPicPr>
+                      <a:picLocks noChangeAspect="1" noChangeArrowheads="1"/>
+                    </pic:cNvPicPr>
+                  </pic:nvPicPr>
+                  <pic:blipFill>
+                    <a:blip r:embed="rId11">
+                      <a:extLst>
+                        <a:ext uri="{28A0092B-C50C-407E-A947-70E740481C1C}">
+                          <a14:useLocalDpi xmlns:a14="http://schemas.microsoft.com/office/drawing/2010/main" val="0"/>
+                        </a:ext>
+                      </a:extLst>
+                    </a:blip>
+                    <a:srcRect/>
+                    <a:stretch>
+                      <a:fillRect/>
+                    </a:stretch>
+                  </pic:blipFill>
+                  <pic:spPr bwMode="auto">
+                    <a:xfrm>
+                      <a:off x="0" y="0"/>
+                      <a:ext cx="5943600" cy="6243955"/>
+                    </a:xfrm>
+                    <a:prstGeom prst="rect">
+                      <a:avLst/>
+                    </a:prstGeom>
+                    <a:noFill/>
+                    <a:ln>
+                      <a:noFill/>
+                    </a:ln>
+                  </pic:spPr>
+                </pic:pic>
+              </a:graphicData>
+            </a:graphic>
+          </wp:inline>
+        </w:drawing>
+      </w:r>
+    </w:p>
+    <w:p>
+      <w:pPr>
+        <w:jc w:val="center"/>
+        <w:rPr>
+          <w:rFonts w:ascii="Times New Roman" w:hAnsi="Times New Roman" w:cs="Times New Roman"/>
+          <w:b/>
+          <w:bCs/>
+          <w:i/>
+          <w:iCs/>
+          <w:sz w:val="24"/>
+          <w:szCs w:val="24"/>
+        </w:rPr>
+      </w:pPr>
+    </w:p>
+    <w:p>
+      <w:pPr>
+        <w:jc w:val="center"/>
+        <w:rPr>
+          <w:rFonts w:ascii="Times New Roman" w:hAnsi="Times New Roman" w:cs="Times New Roman"/>
+          <w:b/>
+          <w:bCs/>
+          <w:i/>
+          <w:iCs/>
+          <w:sz w:val="24"/>
+          <w:szCs w:val="24"/>
+        </w:rPr>
+      </w:pPr>
+    </w:p>
+    <w:p>
+      <w:pPr>
+        <w:jc w:val="center"/>
+        <w:rPr>
+          <w:rFonts w:ascii="Times New Roman" w:hAnsi="Times New Roman" w:cs="Times New Roman"/>
+          <w:b/>
+          <w:bCs/>
+          <w:i/>
+          <w:iCs/>
+          <w:sz w:val="24"/>
+          <w:szCs w:val="24"/>
+        </w:rPr>
+      </w:pPr>
+    </w:p>
+    <w:p>
+      <w:pPr>
+        <w:jc w:val="center"/>
+        <w:rPr>
+          <w:rFonts w:ascii="Times New Roman" w:hAnsi="Times New Roman" w:cs="Times New Roman"/>
+          <w:b/>
+          <w:bCs/>
+          <w:i/>
+          <w:iCs/>
+          <w:sz w:val="24"/>
+          <w:szCs w:val="24"/>
+        </w:rPr>
+      </w:pPr>
+    </w:p>
+    <w:p>
+      <w:pPr>
+        <w:jc w:val="center"/>
+        <w:rPr>
+          <w:rFonts w:ascii="Times New Roman" w:hAnsi="Times New Roman" w:cs="Times New Roman"/>
+          <w:b/>
+          <w:bCs/>
+          <w:i/>
+          <w:iCs/>
+          <w:sz w:val="24"/>
+          <w:szCs w:val="24"/>
+        </w:rPr>
+      </w:pPr>
+    </w:p>
+    <w:p>
+      <w:pPr>
+        <w:jc w:val="center"/>
+        <w:rPr>
+          <w:rFonts w:ascii="Times New Roman" w:hAnsi="Times New Roman" w:cs="Times New Roman"/>
+          <w:b/>
+          <w:bCs/>
+          <w:i/>
+          <w:iCs/>
+          <w:sz w:val="24"/>
+          <w:szCs w:val="24"/>
+        </w:rPr>
+      </w:pPr>
+      <w:r>
+        <w:rPr>
+          <w:rFonts w:ascii="Times New Roman" w:hAnsi="Times New Roman" w:cs="Times New Roman"/>
+          <w:b/>
+          <w:bCs/>
+          <w:i/>
+          <w:iCs/>
+          <w:sz w:val="24"/>
+          <w:szCs w:val="24"/>
+        </w:rPr>
+        <w:t>26</w:t>
+      </w:r>
     </w:p>
     <w:sectPr>
       <w:pgSz w:w="12240" w:h="15840"/>

</xml_diff>